<commit_message>
Actualización de versión documentos
Actualización de versión documentos
</commit_message>
<xml_diff>
--- a/ERS_Cumplimiento_Requerimientos.docx
+++ b/ERS_Cumplimiento_Requerimientos.docx
@@ -1653,7 +1653,7 @@
                 <w:b w:val="false"/>
                 <w:bCs w:val="false"/>
               </w:rPr>
-              <w:t xml:space="preserve">El sistema deberá, cuando el dictamen determine que existe beneficio pensionario, consultar los saldos preliminares del derechohabiente en sus AFORE (ProceSAR) y el sistema de ofertas de renta vitalicia (CNSF), generando el prospecto de beneficiarios correspondiente.</w:t>
+              <w:t xml:space="preserve">El sistema deberá, cuando el dictamen determine que existe beneficio pensionario, consultar los saldos preliminares del derechohabiente (ProceSAR) y consumir el servicio de la Comisión Nacional de Seguros y Fianzas (CNSF) necesario para completar la determinación del beneficio.</w:t>
             </w:r>
           </w:p>
         </w:tc>
@@ -8025,41 +8025,7 @@
         <w:t xml:space="preserve">Supuesto: </w:t>
       </w:r>
       <w:r>
-        <w:t xml:space="preserve">Confirmación de endpoints de producción de IMSS, ProceSAR y el servicio de firma (actualmente documentados sobre ambiente de desarrollo).</w:t>
-      </w:r>
-    </w:p>
-    <w:p>
-      <w:pPr>
-        <w:shd w:fill="E2EFDA" w:val="clear"/>
-        <w:spacing w:after="160"/>
-      </w:pPr>
-      <w:r>
-        <w:rPr>
-          <w:b/>
-          <w:bCs/>
-          <w:color w:val="2E7D32"/>
-        </w:rPr>
-        <w:t xml:space="preserve">Supuesto: </w:t>
-      </w:r>
-      <w:r>
-        <w:t xml:space="preserve">Definición de metas de tiempo de respuesta (SLA) por estatus del trámite.</w:t>
-      </w:r>
-    </w:p>
-    <w:p>
-      <w:pPr>
-        <w:shd w:fill="E2EFDA" w:val="clear"/>
-        <w:spacing w:after="160"/>
-      </w:pPr>
-      <w:r>
-        <w:rPr>
-          <w:b/>
-          <w:bCs/>
-          <w:color w:val="2E7D32"/>
-        </w:rPr>
-        <w:t xml:space="preserve">Supuesto: </w:t>
-      </w:r>
-      <w:r>
-        <w:t xml:space="preserve">Redacción definitiva de la descripción del servicio de firma de cara al usuario final.</w:t>
+        <w:t xml:space="preserve">Los endpoints de producción quedaron confirmados contra el fglprofile y el código fuente (ver FJL-F06 y FJL-F09), incluyendo la ruta efectivamente utilizada para ProceSAR (directa a wsprocesar.com.mx).</w:t>
       </w:r>
     </w:p>
     <w:p>

</xml_diff>